<commit_message>
fix(docs): restaurar portada institucional original de la catedra eliminando subtitulos y colores azules accidentales
</commit_message>
<xml_diff>
--- a/INFORME_FINAL_PROYECTO_SUPERMARKET.docx
+++ b/INFORME_FINAL_PROYECTO_SUPERMARKET.docx
@@ -4,7 +4,7 @@
   <w:body>
     <w:p>
       <w:pPr>
-        <w:spacing w:line="360" w:lineRule="auto" w:before="0" w:after="80"/>
+        <w:spacing w:line="360" w:lineRule="auto"/>
         <w:jc w:val="center"/>
         <w:rPr>
           <w:lang w:val="es-CL"/>
@@ -12,17 +12,76 @@
       </w:pPr>
       <w:r>
         <w:rPr>
-          <w:rFonts w:ascii="Inter" w:hAnsi="Inter"/>
+          <w:noProof/>
+        </w:rPr>
+        <w:drawing>
+          <wp:anchor distT="0" distB="0" distL="0" distR="0" simplePos="0" relativeHeight="251659264" behindDoc="1" locked="0" layoutInCell="1" allowOverlap="1" wp14:anchorId="1740A975" wp14:editId="47883351">
+            <wp:simplePos x="0" y="0"/>
+            <wp:positionH relativeFrom="page">
+              <wp:posOffset>-282501</wp:posOffset>
+            </wp:positionH>
+            <wp:positionV relativeFrom="page">
+              <wp:posOffset>-81504</wp:posOffset>
+            </wp:positionV>
+            <wp:extent cx="8673353" cy="11224339"/>
+            <wp:effectExtent l="0" t="0" r="0" b="0"/>
+            <wp:wrapNone/>
+            <wp:docPr id="1" name="Imagen 1"/>
+            <wp:cNvGraphicFramePr>
+              <a:graphicFrameLocks xmlns:a="http://schemas.openxmlformats.org/drawingml/2006/main" noChangeAspect="1"/>
+            </wp:cNvGraphicFramePr>
+            <a:graphic xmlns:a="http://schemas.openxmlformats.org/drawingml/2006/main">
+              <a:graphicData uri="http://schemas.openxmlformats.org/drawingml/2006/picture">
+                <pic:pic xmlns:pic="http://schemas.openxmlformats.org/drawingml/2006/picture">
+                  <pic:nvPicPr>
+                    <pic:cNvPr id="0" name=""/>
+                    <pic:cNvPicPr>
+                      <a:picLocks noChangeAspect="1" noChangeArrowheads="1"/>
+                    </pic:cNvPicPr>
+                  </pic:nvPicPr>
+                  <pic:blipFill>
+                    <a:blip r:embed="rId7"/>
+                    <a:srcRect/>
+                    <a:stretch>
+                      <a:fillRect/>
+                    </a:stretch>
+                  </pic:blipFill>
+                  <pic:spPr bwMode="auto">
+                    <a:xfrm>
+                      <a:off x="0" y="0"/>
+                      <a:ext cx="8673353" cy="11224339"/>
+                    </a:xfrm>
+                    <a:prstGeom prst="rect">
+                      <a:avLst/>
+                    </a:prstGeom>
+                  </pic:spPr>
+                </pic:pic>
+              </a:graphicData>
+            </a:graphic>
+            <wp14:sizeRelH relativeFrom="margin">
+              <wp14:pctWidth>0</wp14:pctWidth>
+            </wp14:sizeRelH>
+            <wp14:sizeRelV relativeFrom="margin">
+              <wp14:pctHeight>0</wp14:pctHeight>
+            </wp14:sizeRelV>
+          </wp:anchor>
+        </w:drawing>
+      </w:r>
+      <w:r>
+        <w:rPr>
+          <w:rFonts w:ascii="Arial" w:eastAsia="Arial" w:hAnsi="Arial" w:cs="Arial"/>
           <w:b/>
-          <w:color w:val="0F172A"/>
-          <w:sz w:val="32"/>
-        </w:rPr>
-        <w:t>INFORME DE PROYECTO DE INGENIERÍA DE SOFTWARE: SUPERMARKET.CL</w:t>
+          <w:bCs/>
+          <w:sz w:val="40"/>
+          <w:szCs w:val="40"/>
+          <w:lang w:val="es-CL"/>
+        </w:rPr>
+        <w:t>INFORME DE PROYECTO DE INGENIERÍA DE SOFTWARE</w:t>
       </w:r>
     </w:p>
     <w:p>
       <w:pPr>
-        <w:spacing w:before="40" w:after="80" w:line="276" w:lineRule="auto"/>
+        <w:spacing w:before="3300" w:after="160" w:line="276" w:lineRule="auto"/>
         <w:ind w:left="1350" w:right="1000"/>
         <w:rPr>
           <w:lang w:val="es-CL"/>
@@ -30,14 +89,23 @@
       </w:pPr>
       <w:r>
         <w:rPr>
-          <w:rFonts w:ascii="Inter" w:hAnsi="Inter"/>
+          <w:rFonts w:ascii="Arial" w:eastAsia="Arial" w:hAnsi="Arial" w:cs="Arial"/>
           <w:b/>
-          <w:color w:val="0284C7"/>
-          <w:sz w:val="20"/>
-        </w:rPr>
-        <w:t>Marketplace Mayorista Inteligente — Evolución de Arquitectura, Plan de Contingencia Operacional y Reconstrucción Ágil (Transición desde MegaSuper.cl)</w:t>
-        <w:br/>
-        <w:t>Asignatura: Ingeniería de Software | Sección: C1</w:t>
+          <w:bCs/>
+          <w:sz w:val="22"/>
+          <w:szCs w:val="22"/>
+          <w:lang w:val="es-CL"/>
+        </w:rPr>
+        <w:t xml:space="preserve">Asignatura: </w:t>
+      </w:r>
+      <w:r>
+        <w:rPr>
+          <w:rFonts w:ascii="Arial" w:eastAsia="Arial" w:hAnsi="Arial" w:cs="Arial"/>
+          <w:sz w:val="22"/>
+          <w:szCs w:val="22"/>
+          <w:lang w:val="es-CL"/>
+        </w:rPr>
+        <w:t>Ingeniería de Software</w:t>
       </w:r>
     </w:p>
     <w:p>
@@ -50,11 +118,23 @@
       </w:pPr>
       <w:r>
         <w:rPr>
-          <w:rFonts w:ascii="Inter" w:hAnsi="Inter"/>
-          <w:color w:val="334155"/>
-          <w:sz w:val="19"/>
-        </w:rPr>
-        <w:t>Nombre del académico: Felipe Fuentes Ayar</w:t>
+          <w:rFonts w:ascii="Arial" w:eastAsia="Arial" w:hAnsi="Arial" w:cs="Arial"/>
+          <w:b/>
+          <w:bCs/>
+          <w:sz w:val="22"/>
+          <w:szCs w:val="22"/>
+          <w:lang w:val="es-CL"/>
+        </w:rPr>
+        <w:t xml:space="preserve">Sección: </w:t>
+      </w:r>
+      <w:r>
+        <w:rPr>
+          <w:rFonts w:ascii="Arial" w:eastAsia="Arial" w:hAnsi="Arial" w:cs="Arial"/>
+          <w:sz w:val="22"/>
+          <w:szCs w:val="22"/>
+          <w:lang w:val="es-CL"/>
+        </w:rPr>
+        <w:t>C1</w:t>
       </w:r>
     </w:p>
     <w:p>
@@ -67,16 +147,28 @@
       </w:pPr>
       <w:r>
         <w:rPr>
-          <w:rFonts w:ascii="Inter" w:hAnsi="Inter"/>
-          <w:color w:val="64748B"/>
-          <w:sz w:val="18"/>
-        </w:rPr>
-        <w:t>Institución: Universidad / Facultad de Ingeniería y Ciencias Aplicadas</w:t>
+          <w:rFonts w:ascii="Arial" w:eastAsia="Arial" w:hAnsi="Arial" w:cs="Arial"/>
+          <w:b/>
+          <w:bCs/>
+          <w:sz w:val="22"/>
+          <w:szCs w:val="22"/>
+          <w:lang w:val="es-CL"/>
+        </w:rPr>
+        <w:t xml:space="preserve">Nombre del académico: </w:t>
+      </w:r>
+      <w:r>
+        <w:rPr>
+          <w:rFonts w:ascii="Arial" w:eastAsia="Arial" w:hAnsi="Arial" w:cs="Arial"/>
+          <w:sz w:val="22"/>
+          <w:szCs w:val="22"/>
+          <w:lang w:val="es-CL"/>
+        </w:rPr>
+        <w:t>Felipe Fuentes Ayar</w:t>
       </w:r>
     </w:p>
     <w:p>
       <w:pPr>
-        <w:spacing w:after="80" w:line="276" w:lineRule="auto" w:before="80"/>
+        <w:spacing w:after="160" w:line="276" w:lineRule="auto"/>
         <w:ind w:left="1350" w:right="1000"/>
         <w:rPr>
           <w:lang w:val="es-CL"/>
@@ -84,25 +176,106 @@
       </w:pPr>
       <w:r>
         <w:rPr>
-          <w:rFonts w:ascii="Inter" w:hAnsi="Inter"/>
-          <w:color w:val="1E293B"/>
-          <w:sz w:val="18"/>
+          <w:sz w:val="22"/>
+          <w:lang w:val="es-CL"/>
         </w:rPr>
         <w:t>Nombre de los integrantes del grupo y roles:</w:t>
+      </w:r>
+      <w:r>
+        <w:rPr>
+          <w:sz w:val="22"/>
+          <w:lang w:val="es-CL"/>
+        </w:rPr>
         <w:br/>
-        <w:t>Equipo: Los Saybayman</w:t>
+        <w:t xml:space="preserve">  • Sebastián Ortega – </w:t>
+      </w:r>
+      <w:proofErr w:type="spellStart"/>
+      <w:r>
+        <w:rPr>
+          <w:sz w:val="22"/>
+          <w:lang w:val="es-CL"/>
+        </w:rPr>
+        <w:t>Product</w:t>
+      </w:r>
+      <w:proofErr w:type="spellEnd"/>
+      <w:r>
+        <w:rPr>
+          <w:sz w:val="22"/>
+          <w:lang w:val="es-CL"/>
+        </w:rPr>
+        <w:t xml:space="preserve"> Owner (PO)</w:t>
+      </w:r>
+      <w:r>
+        <w:rPr>
+          <w:sz w:val="22"/>
+          <w:lang w:val="es-CL"/>
+        </w:rPr>
         <w:br/>
-        <w:t xml:space="preserve">  • Sebastián Ortega – Product Owner &amp; Dirección de Proyecto / Autor y Líder de Reconstrucción</w:t>
+        <w:t xml:space="preserve">  • Mauricio Vega – Scrum Master (SM)</w:t>
+      </w:r>
+      <w:r>
+        <w:rPr>
+          <w:sz w:val="22"/>
+          <w:lang w:val="es-CL"/>
+        </w:rPr>
         <w:br/>
-        <w:t xml:space="preserve">  • Mauricio Vega – Scrum Master &amp; Secretario de Proyecto (Gobernanza Jira y Auditoría Documental)</w:t>
+        <w:t xml:space="preserve">  • Rodrigo Bravo – </w:t>
+      </w:r>
+      <w:proofErr w:type="spellStart"/>
+      <w:r>
+        <w:rPr>
+          <w:sz w:val="22"/>
+          <w:lang w:val="es-CL"/>
+        </w:rPr>
+        <w:t>Database</w:t>
+      </w:r>
+      <w:proofErr w:type="spellEnd"/>
+      <w:r>
+        <w:rPr>
+          <w:sz w:val="22"/>
+          <w:lang w:val="es-CL"/>
+        </w:rPr>
+        <w:t xml:space="preserve"> </w:t>
+      </w:r>
+      <w:proofErr w:type="spellStart"/>
+      <w:r>
+        <w:rPr>
+          <w:sz w:val="22"/>
+          <w:lang w:val="es-CL"/>
+        </w:rPr>
+        <w:t>Administrator</w:t>
+      </w:r>
+      <w:proofErr w:type="spellEnd"/>
+      <w:r>
+        <w:rPr>
+          <w:sz w:val="22"/>
+          <w:lang w:val="es-CL"/>
+        </w:rPr>
+        <w:t xml:space="preserve"> (DBA) &amp; QA Lead</w:t>
+      </w:r>
+      <w:r>
+        <w:rPr>
+          <w:sz w:val="22"/>
+          <w:lang w:val="es-CL"/>
+        </w:rPr>
         <w:br/>
-        <w:t xml:space="preserve">  • Rodrigo Bravo – DBA Lead &amp; Modelador de Sistemas (UML 2.5 y Base de Datos Relacional 3FN)</w:t>
+        <w:t xml:space="preserve">  • Francisco Cárcamo – Desarrollador Backend &amp; Modelado de Datos</w:t>
+      </w:r>
+      <w:r>
+        <w:rPr>
+          <w:sz w:val="22"/>
+          <w:lang w:val="es-CL"/>
+        </w:rPr>
         <w:br/>
-        <w:t xml:space="preserve">  • Francisco Cárcamo – QA Lead Full-Time (Aseguramiento de Calidad de Backoffice y Seguridad)</w:t>
+        <w:t xml:space="preserve">  • Peter Cañarte – Desarrollador Frontend &amp; Integración de Catálogo</w:t>
+      </w:r>
+      <w:r>
+        <w:rPr>
+          <w:sz w:val="22"/>
+          <w:lang w:val="es-CL"/>
+        </w:rPr>
         <w:br/>
-        <w:t xml:space="preserve">  • Peter Cañarte – QA Lead Full-Time (Aseguramiento de Calidad de Catálogo y Motor de Precios)</w:t>
-        <w:br/>
-        <w:t xml:space="preserve">  • Juan Mena – Desarrollador Full Stack inicial (Se retiró del grupo de forma unilateral llevándose el código base del proyecto, formalizado en Memorándum de Equipo N° 02/2026)</w:t>
+        <w:t xml:space="preserve">  • Juan Mena – Desarrollador Full Stack &amp; Integración de Servicios</w:t>
       </w:r>
     </w:p>
     <w:p>
@@ -121,12 +294,14 @@
       </w:pPr>
       <w:r>
         <w:rPr>
-          <w:rFonts w:ascii="Inter" w:hAnsi="Inter"/>
+          <w:rFonts w:ascii="Arial" w:eastAsia="Arial" w:hAnsi="Arial" w:cs="Arial"/>
           <w:b/>
-          <w:color w:val="0F766E"/>
-          <w:sz w:val="18"/>
-        </w:rPr>
-        <w:t>Fecha de entrega definitiva: 08-10-2026 (Entrega y Regularización Extraordinaria)</w:t>
+          <w:bCs/>
+          <w:sz w:val="22"/>
+          <w:szCs w:val="22"/>
+          <w:lang w:val="es-CL"/>
+        </w:rPr>
+        <w:t>Fecha de entrega: 6-10-2026</w:t>
       </w:r>
     </w:p>
     <w:p>

</xml_diff>

<commit_message>
Revert "fix(docs): restaurar portada institucional original de la catedra eliminando subtitulos y colores azules accidentales"
This reverts commit 950c2d81cec99e4954f4b91faed00356bfd21356.
</commit_message>
<xml_diff>
--- a/INFORME_FINAL_PROYECTO_SUPERMARKET.docx
+++ b/INFORME_FINAL_PROYECTO_SUPERMARKET.docx
@@ -4,7 +4,7 @@
   <w:body>
     <w:p>
       <w:pPr>
-        <w:spacing w:line="360" w:lineRule="auto"/>
+        <w:spacing w:line="360" w:lineRule="auto" w:before="0" w:after="80"/>
         <w:jc w:val="center"/>
         <w:rPr>
           <w:lang w:val="es-CL"/>
@@ -12,76 +12,17 @@
       </w:pPr>
       <w:r>
         <w:rPr>
-          <w:noProof/>
-        </w:rPr>
-        <w:drawing>
-          <wp:anchor distT="0" distB="0" distL="0" distR="0" simplePos="0" relativeHeight="251659264" behindDoc="1" locked="0" layoutInCell="1" allowOverlap="1" wp14:anchorId="1740A975" wp14:editId="47883351">
-            <wp:simplePos x="0" y="0"/>
-            <wp:positionH relativeFrom="page">
-              <wp:posOffset>-282501</wp:posOffset>
-            </wp:positionH>
-            <wp:positionV relativeFrom="page">
-              <wp:posOffset>-81504</wp:posOffset>
-            </wp:positionV>
-            <wp:extent cx="8673353" cy="11224339"/>
-            <wp:effectExtent l="0" t="0" r="0" b="0"/>
-            <wp:wrapNone/>
-            <wp:docPr id="1" name="Imagen 1"/>
-            <wp:cNvGraphicFramePr>
-              <a:graphicFrameLocks xmlns:a="http://schemas.openxmlformats.org/drawingml/2006/main" noChangeAspect="1"/>
-            </wp:cNvGraphicFramePr>
-            <a:graphic xmlns:a="http://schemas.openxmlformats.org/drawingml/2006/main">
-              <a:graphicData uri="http://schemas.openxmlformats.org/drawingml/2006/picture">
-                <pic:pic xmlns:pic="http://schemas.openxmlformats.org/drawingml/2006/picture">
-                  <pic:nvPicPr>
-                    <pic:cNvPr id="0" name=""/>
-                    <pic:cNvPicPr>
-                      <a:picLocks noChangeAspect="1" noChangeArrowheads="1"/>
-                    </pic:cNvPicPr>
-                  </pic:nvPicPr>
-                  <pic:blipFill>
-                    <a:blip r:embed="rId7"/>
-                    <a:srcRect/>
-                    <a:stretch>
-                      <a:fillRect/>
-                    </a:stretch>
-                  </pic:blipFill>
-                  <pic:spPr bwMode="auto">
-                    <a:xfrm>
-                      <a:off x="0" y="0"/>
-                      <a:ext cx="8673353" cy="11224339"/>
-                    </a:xfrm>
-                    <a:prstGeom prst="rect">
-                      <a:avLst/>
-                    </a:prstGeom>
-                  </pic:spPr>
-                </pic:pic>
-              </a:graphicData>
-            </a:graphic>
-            <wp14:sizeRelH relativeFrom="margin">
-              <wp14:pctWidth>0</wp14:pctWidth>
-            </wp14:sizeRelH>
-            <wp14:sizeRelV relativeFrom="margin">
-              <wp14:pctHeight>0</wp14:pctHeight>
-            </wp14:sizeRelV>
-          </wp:anchor>
-        </w:drawing>
-      </w:r>
-      <w:r>
-        <w:rPr>
-          <w:rFonts w:ascii="Arial" w:eastAsia="Arial" w:hAnsi="Arial" w:cs="Arial"/>
+          <w:rFonts w:ascii="Inter" w:hAnsi="Inter"/>
           <w:b/>
-          <w:bCs/>
-          <w:sz w:val="40"/>
-          <w:szCs w:val="40"/>
-          <w:lang w:val="es-CL"/>
-        </w:rPr>
-        <w:t>INFORME DE PROYECTO DE INGENIERÍA DE SOFTWARE</w:t>
+          <w:color w:val="0F172A"/>
+          <w:sz w:val="32"/>
+        </w:rPr>
+        <w:t>INFORME DE PROYECTO DE INGENIERÍA DE SOFTWARE: SUPERMARKET.CL</w:t>
       </w:r>
     </w:p>
     <w:p>
       <w:pPr>
-        <w:spacing w:before="3300" w:after="160" w:line="276" w:lineRule="auto"/>
+        <w:spacing w:before="40" w:after="80" w:line="276" w:lineRule="auto"/>
         <w:ind w:left="1350" w:right="1000"/>
         <w:rPr>
           <w:lang w:val="es-CL"/>
@@ -89,23 +30,14 @@
       </w:pPr>
       <w:r>
         <w:rPr>
-          <w:rFonts w:ascii="Arial" w:eastAsia="Arial" w:hAnsi="Arial" w:cs="Arial"/>
+          <w:rFonts w:ascii="Inter" w:hAnsi="Inter"/>
           <w:b/>
-          <w:bCs/>
-          <w:sz w:val="22"/>
-          <w:szCs w:val="22"/>
-          <w:lang w:val="es-CL"/>
-        </w:rPr>
-        <w:t xml:space="preserve">Asignatura: </w:t>
-      </w:r>
-      <w:r>
-        <w:rPr>
-          <w:rFonts w:ascii="Arial" w:eastAsia="Arial" w:hAnsi="Arial" w:cs="Arial"/>
-          <w:sz w:val="22"/>
-          <w:szCs w:val="22"/>
-          <w:lang w:val="es-CL"/>
-        </w:rPr>
-        <w:t>Ingeniería de Software</w:t>
+          <w:color w:val="0284C7"/>
+          <w:sz w:val="20"/>
+        </w:rPr>
+        <w:t>Marketplace Mayorista Inteligente — Evolución de Arquitectura, Plan de Contingencia Operacional y Reconstrucción Ágil (Transición desde MegaSuper.cl)</w:t>
+        <w:br/>
+        <w:t>Asignatura: Ingeniería de Software | Sección: C1</w:t>
       </w:r>
     </w:p>
     <w:p>
@@ -118,23 +50,11 @@
       </w:pPr>
       <w:r>
         <w:rPr>
-          <w:rFonts w:ascii="Arial" w:eastAsia="Arial" w:hAnsi="Arial" w:cs="Arial"/>
-          <w:b/>
-          <w:bCs/>
-          <w:sz w:val="22"/>
-          <w:szCs w:val="22"/>
-          <w:lang w:val="es-CL"/>
-        </w:rPr>
-        <w:t xml:space="preserve">Sección: </w:t>
-      </w:r>
-      <w:r>
-        <w:rPr>
-          <w:rFonts w:ascii="Arial" w:eastAsia="Arial" w:hAnsi="Arial" w:cs="Arial"/>
-          <w:sz w:val="22"/>
-          <w:szCs w:val="22"/>
-          <w:lang w:val="es-CL"/>
-        </w:rPr>
-        <w:t>C1</w:t>
+          <w:rFonts w:ascii="Inter" w:hAnsi="Inter"/>
+          <w:color w:val="334155"/>
+          <w:sz w:val="19"/>
+        </w:rPr>
+        <w:t>Nombre del académico: Felipe Fuentes Ayar</w:t>
       </w:r>
     </w:p>
     <w:p>
@@ -147,28 +67,16 @@
       </w:pPr>
       <w:r>
         <w:rPr>
-          <w:rFonts w:ascii="Arial" w:eastAsia="Arial" w:hAnsi="Arial" w:cs="Arial"/>
-          <w:b/>
-          <w:bCs/>
-          <w:sz w:val="22"/>
-          <w:szCs w:val="22"/>
-          <w:lang w:val="es-CL"/>
-        </w:rPr>
-        <w:t xml:space="preserve">Nombre del académico: </w:t>
-      </w:r>
-      <w:r>
-        <w:rPr>
-          <w:rFonts w:ascii="Arial" w:eastAsia="Arial" w:hAnsi="Arial" w:cs="Arial"/>
-          <w:sz w:val="22"/>
-          <w:szCs w:val="22"/>
-          <w:lang w:val="es-CL"/>
-        </w:rPr>
-        <w:t>Felipe Fuentes Ayar</w:t>
+          <w:rFonts w:ascii="Inter" w:hAnsi="Inter"/>
+          <w:color w:val="64748B"/>
+          <w:sz w:val="18"/>
+        </w:rPr>
+        <w:t>Institución: Universidad / Facultad de Ingeniería y Ciencias Aplicadas</w:t>
       </w:r>
     </w:p>
     <w:p>
       <w:pPr>
-        <w:spacing w:after="160" w:line="276" w:lineRule="auto"/>
+        <w:spacing w:after="80" w:line="276" w:lineRule="auto" w:before="80"/>
         <w:ind w:left="1350" w:right="1000"/>
         <w:rPr>
           <w:lang w:val="es-CL"/>
@@ -176,106 +84,25 @@
       </w:pPr>
       <w:r>
         <w:rPr>
-          <w:sz w:val="22"/>
-          <w:lang w:val="es-CL"/>
+          <w:rFonts w:ascii="Inter" w:hAnsi="Inter"/>
+          <w:color w:val="1E293B"/>
+          <w:sz w:val="18"/>
         </w:rPr>
         <w:t>Nombre de los integrantes del grupo y roles:</w:t>
-      </w:r>
-      <w:r>
-        <w:rPr>
-          <w:sz w:val="22"/>
-          <w:lang w:val="es-CL"/>
-        </w:rPr>
         <w:br/>
-        <w:t xml:space="preserve">  • Sebastián Ortega – </w:t>
-      </w:r>
-      <w:proofErr w:type="spellStart"/>
-      <w:r>
-        <w:rPr>
-          <w:sz w:val="22"/>
-          <w:lang w:val="es-CL"/>
-        </w:rPr>
-        <w:t>Product</w:t>
-      </w:r>
-      <w:proofErr w:type="spellEnd"/>
-      <w:r>
-        <w:rPr>
-          <w:sz w:val="22"/>
-          <w:lang w:val="es-CL"/>
-        </w:rPr>
-        <w:t xml:space="preserve"> Owner (PO)</w:t>
-      </w:r>
-      <w:r>
-        <w:rPr>
-          <w:sz w:val="22"/>
-          <w:lang w:val="es-CL"/>
-        </w:rPr>
+        <w:t>Equipo: Los Saybayman</w:t>
         <w:br/>
-        <w:t xml:space="preserve">  • Mauricio Vega – Scrum Master (SM)</w:t>
-      </w:r>
-      <w:r>
-        <w:rPr>
-          <w:sz w:val="22"/>
-          <w:lang w:val="es-CL"/>
-        </w:rPr>
+        <w:t xml:space="preserve">  • Sebastián Ortega – Product Owner &amp; Dirección de Proyecto / Autor y Líder de Reconstrucción</w:t>
         <w:br/>
-        <w:t xml:space="preserve">  • Rodrigo Bravo – </w:t>
-      </w:r>
-      <w:proofErr w:type="spellStart"/>
-      <w:r>
-        <w:rPr>
-          <w:sz w:val="22"/>
-          <w:lang w:val="es-CL"/>
-        </w:rPr>
-        <w:t>Database</w:t>
-      </w:r>
-      <w:proofErr w:type="spellEnd"/>
-      <w:r>
-        <w:rPr>
-          <w:sz w:val="22"/>
-          <w:lang w:val="es-CL"/>
-        </w:rPr>
-        <w:t xml:space="preserve"> </w:t>
-      </w:r>
-      <w:proofErr w:type="spellStart"/>
-      <w:r>
-        <w:rPr>
-          <w:sz w:val="22"/>
-          <w:lang w:val="es-CL"/>
-        </w:rPr>
-        <w:t>Administrator</w:t>
-      </w:r>
-      <w:proofErr w:type="spellEnd"/>
-      <w:r>
-        <w:rPr>
-          <w:sz w:val="22"/>
-          <w:lang w:val="es-CL"/>
-        </w:rPr>
-        <w:t xml:space="preserve"> (DBA) &amp; QA Lead</w:t>
-      </w:r>
-      <w:r>
-        <w:rPr>
-          <w:sz w:val="22"/>
-          <w:lang w:val="es-CL"/>
-        </w:rPr>
+        <w:t xml:space="preserve">  • Mauricio Vega – Scrum Master &amp; Secretario de Proyecto (Gobernanza Jira y Auditoría Documental)</w:t>
         <w:br/>
-        <w:t xml:space="preserve">  • Francisco Cárcamo – Desarrollador Backend &amp; Modelado de Datos</w:t>
-      </w:r>
-      <w:r>
-        <w:rPr>
-          <w:sz w:val="22"/>
-          <w:lang w:val="es-CL"/>
-        </w:rPr>
+        <w:t xml:space="preserve">  • Rodrigo Bravo – DBA Lead &amp; Modelador de Sistemas (UML 2.5 y Base de Datos Relacional 3FN)</w:t>
         <w:br/>
-        <w:t xml:space="preserve">  • Peter Cañarte – Desarrollador Frontend &amp; Integración de Catálogo</w:t>
-      </w:r>
-      <w:r>
-        <w:rPr>
-          <w:sz w:val="22"/>
-          <w:lang w:val="es-CL"/>
-        </w:rPr>
+        <w:t xml:space="preserve">  • Francisco Cárcamo – QA Lead Full-Time (Aseguramiento de Calidad de Backoffice y Seguridad)</w:t>
         <w:br/>
-        <w:t xml:space="preserve">  • Juan Mena – Desarrollador Full Stack &amp; Integración de Servicios</w:t>
+        <w:t xml:space="preserve">  • Peter Cañarte – QA Lead Full-Time (Aseguramiento de Calidad de Catálogo y Motor de Precios)</w:t>
+        <w:br/>
+        <w:t xml:space="preserve">  • Juan Mena – Desarrollador Full Stack inicial (Se retiró del grupo de forma unilateral llevándose el código base del proyecto, formalizado en Memorándum de Equipo N° 02/2026)</w:t>
       </w:r>
     </w:p>
     <w:p>
@@ -294,14 +121,12 @@
       </w:pPr>
       <w:r>
         <w:rPr>
-          <w:rFonts w:ascii="Arial" w:eastAsia="Arial" w:hAnsi="Arial" w:cs="Arial"/>
+          <w:rFonts w:ascii="Inter" w:hAnsi="Inter"/>
           <w:b/>
-          <w:bCs/>
-          <w:sz w:val="22"/>
-          <w:szCs w:val="22"/>
-          <w:lang w:val="es-CL"/>
-        </w:rPr>
-        <w:t>Fecha de entrega: 6-10-2026</w:t>
+          <w:color w:val="0F766E"/>
+          <w:sz w:val="18"/>
+        </w:rPr>
+        <w:t>Fecha de entrega definitiva: 08-10-2026 (Entrega y Regularización Extraordinaria)</w:t>
       </w:r>
     </w:p>
     <w:p>

</xml_diff>